<commit_message>
fix: finalize competency reports and participant resume
Finalize the customer Word report contract and LibreOffice chart calibration, force explicit report regeneration, preserve participant resume position across assessment types, hide public participant browser titles, and add regression/verification coverage and staging records.
</commit_message>
<xml_diff>
--- a/Go-based Refactored System/configs/export-templates/competency-phase1-report-embedded.docx
+++ b/Go-based Refactored System/configs/export-templates/competency-phase1-report-embedded.docx
@@ -1958,7 +1958,7 @@
                   <wp:extent cx="4151630" cy="2211705"/>
                   <wp:effectExtent l="0" t="0" r="1270" b="0"/>
                   <wp:wrapTopAndBottom/>
-                  <wp:docPr id="114" name="图表 1" descr="7b0a202020202263686172745265734964223a20223230343736343634220a7d0a"/>
+                  <wp:docPr id="114" name="图表 1" descr="7b0a202020202263686172745265734964223a20223230343736343634220a7d0a" title="chart.group.overview"/>
                   <wp:cNvGraphicFramePr/>
                   <a:graphic xmlns:a="http://schemas.openxmlformats.org/drawingml/2006/main">
                     <a:graphicData uri="http://schemas.openxmlformats.org/drawingml/2006/chart">
@@ -2544,7 +2544,7 @@
             <wp:extent cx="4826000" cy="2743200"/>
             <wp:effectExtent l="0" t="0" r="0" b="0"/>
             <wp:wrapTopAndBottom/>
-            <wp:docPr id="11" name="图表 7"/>
+            <wp:docPr id="11" name="图表 7" title="chart.dimension.radar"/>
             <wp:cNvGraphicFramePr/>
             <a:graphic xmlns:a="http://schemas.openxmlformats.org/drawingml/2006/main">
               <a:graphicData uri="http://schemas.openxmlformats.org/drawingml/2006/chart">
@@ -3065,7 +3065,7 @@
                   <wp:extent cx="1908810" cy="1085215"/>
                   <wp:effectExtent l="0" t="0" r="0" b="635"/>
                   <wp:wrapTopAndBottom/>
-                  <wp:docPr id="115" name="图表 2" descr="7b0a202020202263686172745265734964223a20223530303539353737220a7d0a"/>
+                  <wp:docPr id="115" name="图表 2" descr="7b0a202020202263686172745265734964223a20223530303539353737220a7d0a" title="chart.dimension.competency-a1-01"/>
                   <wp:cNvGraphicFramePr/>
                   <a:graphic xmlns:a="http://schemas.openxmlformats.org/drawingml/2006/main">
                     <a:graphicData uri="http://schemas.openxmlformats.org/drawingml/2006/chart">
@@ -3520,7 +3520,7 @@
                 <wp:inline distT="0" distB="0" distL="114300" distR="114300" wp14:anchorId="0497AFCF" wp14:editId="4A403F29">
                   <wp:extent cx="1920875" cy="1091565"/>
                   <wp:effectExtent l="0" t="0" r="3175" b="51435"/>
-                  <wp:docPr id="116" name="图表 2" descr="7b0a202020202263686172745265734964223a20223530303539353737220a7d0a"/>
+                  <wp:docPr id="116" name="图表 2" descr="7b0a202020202263686172745265734964223a20223530303539353737220a7d0a" title="chart.dimension.competency-a1-02"/>
                   <wp:cNvGraphicFramePr/>
                   <a:graphic xmlns:a="http://schemas.openxmlformats.org/drawingml/2006/main">
                     <a:graphicData uri="http://schemas.openxmlformats.org/drawingml/2006/chart">
@@ -3972,7 +3972,7 @@
                 <wp:inline distT="0" distB="0" distL="114300" distR="114300" wp14:anchorId="2F4B8EBE" wp14:editId="00AFCFC4">
                   <wp:extent cx="1907540" cy="1084580"/>
                   <wp:effectExtent l="0" t="0" r="16510" b="58420"/>
-                  <wp:docPr id="117" name="图表 2" descr="7b0a202020202263686172745265734964223a20223530303539353737220a7d0a"/>
+                  <wp:docPr id="117" name="图表 2" descr="7b0a202020202263686172745265734964223a20223530303539353737220a7d0a" title="chart.dimension.competency-a1-03"/>
                   <wp:cNvGraphicFramePr/>
                   <a:graphic xmlns:a="http://schemas.openxmlformats.org/drawingml/2006/main">
                     <a:graphicData uri="http://schemas.openxmlformats.org/drawingml/2006/chart">
@@ -4415,7 +4415,7 @@
                 <wp:inline distT="0" distB="0" distL="114300" distR="114300" wp14:anchorId="5C060DB9" wp14:editId="6F495110">
                   <wp:extent cx="1951355" cy="1111885"/>
                   <wp:effectExtent l="0" t="0" r="10795" b="50165"/>
-                  <wp:docPr id="118" name="图表 2" descr="7b0a202020202263686172745265734964223a20223530303539353737220a7d0a"/>
+                  <wp:docPr id="118" name="图表 2" descr="7b0a202020202263686172745265734964223a20223530303539353737220a7d0a" title="chart.dimension.competency-a1-04"/>
                   <wp:cNvGraphicFramePr/>
                   <a:graphic xmlns:a="http://schemas.openxmlformats.org/drawingml/2006/main">
                     <a:graphicData uri="http://schemas.openxmlformats.org/drawingml/2006/chart">
@@ -4863,7 +4863,7 @@
                 <wp:inline distT="0" distB="0" distL="114300" distR="114300" wp14:anchorId="369F8499" wp14:editId="20AEC218">
                   <wp:extent cx="1919605" cy="1091565"/>
                   <wp:effectExtent l="0" t="0" r="4445" b="51435"/>
-                  <wp:docPr id="119" name="图表 2" descr="7b0a202020202263686172745265734964223a20223530303539353737220a7d0a"/>
+                  <wp:docPr id="119" name="图表 2" descr="7b0a202020202263686172745265734964223a20223530303539353737220a7d0a" title="chart.dimension.competency-a1-05"/>
                   <wp:cNvGraphicFramePr/>
                   <a:graphic xmlns:a="http://schemas.openxmlformats.org/drawingml/2006/main">
                     <a:graphicData uri="http://schemas.openxmlformats.org/drawingml/2006/chart">
@@ -5387,7 +5387,7 @@
                 <wp:inline distT="0" distB="0" distL="114300" distR="114300" wp14:anchorId="4E37FE4D" wp14:editId="0B522031">
                   <wp:extent cx="1925955" cy="1095375"/>
                   <wp:effectExtent l="0" t="0" r="17145" b="47625"/>
-                  <wp:docPr id="46" name="图表 3" descr="7b0a202020202263686172745265734964223a20223530303539353737220a7d0a"/>
+                  <wp:docPr id="46" name="图表 3" descr="7b0a202020202263686172745265734964223a20223530303539353737220a7d0a" title="chart.dimension.competency-b1-01"/>
                   <wp:cNvGraphicFramePr/>
                   <a:graphic xmlns:a="http://schemas.openxmlformats.org/drawingml/2006/main">
                     <a:graphicData uri="http://schemas.openxmlformats.org/drawingml/2006/chart">
@@ -5841,7 +5841,7 @@
                 <wp:inline distT="0" distB="0" distL="114300" distR="114300" wp14:anchorId="583CA0EB" wp14:editId="4E6A87FE">
                   <wp:extent cx="2065020" cy="1174115"/>
                   <wp:effectExtent l="0" t="0" r="11430" b="45085"/>
-                  <wp:docPr id="122" name="图表 3" descr="7b0a202020202263686172745265734964223a20223530303539353737220a7d0a"/>
+                  <wp:docPr id="122" name="图表 3" descr="7b0a202020202263686172745265734964223a20223530303539353737220a7d0a" title="chart.dimension.competency-b1-02"/>
                   <wp:cNvGraphicFramePr/>
                   <a:graphic xmlns:a="http://schemas.openxmlformats.org/drawingml/2006/main">
                     <a:graphicData uri="http://schemas.openxmlformats.org/drawingml/2006/chart">
@@ -6290,7 +6290,7 @@
                 <wp:inline distT="0" distB="0" distL="114300" distR="114300" wp14:anchorId="378D7ADB" wp14:editId="7CCEBD5E">
                   <wp:extent cx="2065020" cy="1174115"/>
                   <wp:effectExtent l="0" t="0" r="11430" b="45085"/>
-                  <wp:docPr id="123" name="图表 3" descr="7b0a202020202263686172745265734964223a20223530303539353737220a7d0a"/>
+                  <wp:docPr id="123" name="图表 3" descr="7b0a202020202263686172745265734964223a20223530303539353737220a7d0a" title="chart.dimension.competency-b1-03"/>
                   <wp:cNvGraphicFramePr/>
                   <a:graphic xmlns:a="http://schemas.openxmlformats.org/drawingml/2006/main">
                     <a:graphicData uri="http://schemas.openxmlformats.org/drawingml/2006/chart">
@@ -6733,7 +6733,7 @@
                 <wp:inline distT="0" distB="0" distL="114300" distR="114300" wp14:anchorId="496CBA13" wp14:editId="6B2B5466">
                   <wp:extent cx="2147570" cy="1221105"/>
                   <wp:effectExtent l="0" t="0" r="5080" b="55245"/>
-                  <wp:docPr id="124" name="图表 3" descr="7b0a202020202263686172745265734964223a20223530303539353737220a7d0a"/>
+                  <wp:docPr id="124" name="图表 3" descr="7b0a202020202263686172745265734964223a20223530303539353737220a7d0a" title="chart.dimension.competency-b1-04"/>
                   <wp:cNvGraphicFramePr/>
                   <a:graphic xmlns:a="http://schemas.openxmlformats.org/drawingml/2006/main">
                     <a:graphicData uri="http://schemas.openxmlformats.org/drawingml/2006/chart">
@@ -7189,7 +7189,7 @@
                 <wp:inline distT="0" distB="0" distL="114300" distR="114300" wp14:anchorId="7DA45DA2" wp14:editId="7B158857">
                   <wp:extent cx="1960245" cy="1114425"/>
                   <wp:effectExtent l="0" t="0" r="1905" b="47625"/>
-                  <wp:docPr id="42" name="图表 2" descr="7b0a202020202263686172745265734964223a20223530303539353737220a7d0a"/>
+                  <wp:docPr id="42" name="图表 2" descr="7b0a202020202263686172745265734964223a20223530303539353737220a7d0a" title="chart.dimension.competency-b1-05"/>
                   <wp:cNvGraphicFramePr/>
                   <a:graphic xmlns:a="http://schemas.openxmlformats.org/drawingml/2006/main">
                     <a:graphicData uri="http://schemas.openxmlformats.org/drawingml/2006/chart">
@@ -8493,7 +8493,7 @@
           </c:dLbls>
           <c:cat>
             <c:strRef>
-              <c:f>[competency-phase1-chart-data.xlsx]Sheet1!$A$2:$A$3</c:f>
+              <c:f>[competency-phase1-chart-data.xlsx]ChartData!$B$2:$B$3</c:f>
               <c:strCache>
                 <c:ptCount val="2"/>
                 <c:pt idx="0">
@@ -8507,7 +8507,7 @@
           </c:cat>
           <c:val>
             <c:numRef>
-              <c:f>[competency-phase1-chart-data.xlsx]Sheet1!$B$2:$B$3</c:f>
+              <c:f>[competency-phase1-chart-data.xlsx]ChartData!$C$2:$C$3</c:f>
               <c:numCache>
                 <c:formatCode>General</c:formatCode>
                 <c:ptCount val="2"/>
@@ -8788,7 +8788,7 @@
           </c:dLbls>
           <c:val>
             <c:numRef>
-              <c:f>[competency-phase1-chart-data.xlsx]Sheet2!$B$40:$C$40</c:f>
+              <c:f>[competency-phase1-chart-data.xlsx]ChartData!$C$11:$D$11</c:f>
               <c:numCache>
                 <c:formatCode>0.00_);[Red]\(0.00\)</c:formatCode>
                 <c:ptCount val="2"/>
@@ -9072,7 +9072,7 @@
           </c:dLbls>
           <c:val>
             <c:numRef>
-              <c:f>[competency-phase1-chart-data.xlsx]Sheet2!$B$41:$C$41</c:f>
+              <c:f>[competency-phase1-chart-data.xlsx]ChartData!$C$12:$D$12</c:f>
               <c:numCache>
                 <c:formatCode>0.00_);[Red]\(0.00\)</c:formatCode>
                 <c:ptCount val="2"/>
@@ -9364,7 +9364,7 @@
           </c:dLbls>
           <c:val>
             <c:numRef>
-              <c:f>[competency-phase1-chart-data.xlsx]Sheet2!$B$42:$C$42</c:f>
+              <c:f>[competency-phase1-chart-data.xlsx]ChartData!$C$13:$D$13</c:f>
               <c:numCache>
                 <c:formatCode>0.00_);[Red]\(0.00\)</c:formatCode>
                 <c:ptCount val="2"/>
@@ -9487,7 +9487,7 @@
           <c:order val="0"/>
           <c:tx>
             <c:strRef>
-              <c:f>[competency-phase1-chart-data.xlsx]Sheet2!$B$3</c:f>
+              <c:f>[competency-phase1-chart-data.xlsx]ChartData!$C$1</c:f>
               <c:strCache>
                 <c:ptCount val="1"/>
                 <c:pt idx="0">
@@ -9784,7 +9784,7 @@
           </c:dLbls>
           <c:cat>
             <c:strRef>
-              <c:f>[competency-phase1-chart-data.xlsx]Sheet2!$A$4:$A$13</c:f>
+              <c:f>[competency-phase1-chart-data.xlsx]ChartData!$B$4:$B$13</c:f>
               <c:strCache>
                 <c:ptCount val="10"/>
                 <c:pt idx="0">
@@ -9822,7 +9822,7 @@
           </c:cat>
           <c:val>
             <c:numRef>
-              <c:f>[competency-phase1-chart-data.xlsx]Sheet2!$B$4:$B$13</c:f>
+              <c:f>[competency-phase1-chart-data.xlsx]ChartData!$C$4:$C$13</c:f>
               <c:numCache>
                 <c:formatCode>0.00_);[Red]\(0.00\)</c:formatCode>
                 <c:ptCount val="10"/>
@@ -9884,7 +9884,7 @@
           <c:order val="1"/>
           <c:tx>
             <c:strRef>
-              <c:f>[competency-phase1-chart-data.xlsx]Sheet2!$C$3</c:f>
+              <c:f>[competency-phase1-chart-data.xlsx]ChartData!$D$1</c:f>
               <c:strCache>
                 <c:ptCount val="1"/>
               </c:strCache>
@@ -10178,7 +10178,7 @@
           </c:dLbls>
           <c:cat>
             <c:strRef>
-              <c:f>[competency-phase1-chart-data.xlsx]Sheet2!$A$4:$A$13</c:f>
+              <c:f>[competency-phase1-chart-data.xlsx]ChartData!$B$4:$B$13</c:f>
               <c:strCache>
                 <c:ptCount val="10"/>
                 <c:pt idx="0">
@@ -10216,7 +10216,7 @@
           </c:cat>
           <c:val>
             <c:numRef>
-              <c:f>[competency-phase1-chart-data.xlsx]Sheet2!$C$4:$C$13</c:f>
+              <c:f>[competency-phase1-chart-data.xlsx]ChartData!$D$4:$D$13</c:f>
               <c:numCache>
                 <c:formatCode>General</c:formatCode>
                 <c:ptCount val="10"/>
@@ -10691,7 +10691,7 @@
           </c:dLbls>
           <c:val>
             <c:numRef>
-              <c:f>[competency-phase1-chart-data.xlsx]Sheet2!$B$33:$C$33</c:f>
+              <c:f>[competency-phase1-chart-data.xlsx]ChartData!$C$4:$D$4</c:f>
               <c:numCache>
                 <c:formatCode>0.00_);[Red]\(0.00\)</c:formatCode>
                 <c:ptCount val="2"/>
@@ -10980,7 +10980,7 @@
           </c:dLbls>
           <c:val>
             <c:numRef>
-              <c:f>[competency-phase1-chart-data.xlsx]Sheet2!$B$34:$C$34</c:f>
+              <c:f>[competency-phase1-chart-data.xlsx]ChartData!$C$5:$D$5</c:f>
               <c:numCache>
                 <c:formatCode>0.00_);[Red]\(0.00\)</c:formatCode>
                 <c:ptCount val="2"/>
@@ -11269,7 +11269,7 @@
           </c:dLbls>
           <c:val>
             <c:numRef>
-              <c:f>[competency-phase1-chart-data.xlsx]Sheet2!$B$35:$C$35</c:f>
+              <c:f>[competency-phase1-chart-data.xlsx]ChartData!$C$6:$D$6</c:f>
               <c:numCache>
                 <c:formatCode>0.00_);[Red]\(0.00\)</c:formatCode>
                 <c:ptCount val="2"/>
@@ -11558,7 +11558,7 @@
           </c:dLbls>
           <c:val>
             <c:numRef>
-              <c:f>[competency-phase1-chart-data.xlsx]Sheet2!$B$36:$C$36</c:f>
+              <c:f>[competency-phase1-chart-data.xlsx]ChartData!$C$7:$D$7</c:f>
               <c:numCache>
                 <c:formatCode>0.00_);[Red]\(0.00\)</c:formatCode>
                 <c:ptCount val="2"/>
@@ -11847,7 +11847,7 @@
           </c:dLbls>
           <c:val>
             <c:numRef>
-              <c:f>[competency-phase1-chart-data.xlsx]Sheet2!$B$37:$C$37</c:f>
+              <c:f>[competency-phase1-chart-data.xlsx]ChartData!$C$8:$D$8</c:f>
               <c:numCache>
                 <c:formatCode>0.00_);[Red]\(0.00\)</c:formatCode>
                 <c:ptCount val="2"/>
@@ -12131,7 +12131,7 @@
           </c:dLbls>
           <c:val>
             <c:numRef>
-              <c:f>[competency-phase1-chart-data.xlsx]Sheet2!$B$38:$C$38</c:f>
+              <c:f>[competency-phase1-chart-data.xlsx]ChartData!$C$9:$D$9</c:f>
               <c:numCache>
                 <c:formatCode>0.00_);[Red]\(0.00\)</c:formatCode>
                 <c:ptCount val="2"/>
@@ -12415,7 +12415,7 @@
           </c:dLbls>
           <c:val>
             <c:numRef>
-              <c:f>[competency-phase1-chart-data.xlsx]Sheet2!$B$39:$C$39</c:f>
+              <c:f>[competency-phase1-chart-data.xlsx]ChartData!$C$10:$D$10</c:f>
               <c:numCache>
                 <c:formatCode>0.00_);[Red]\(0.00\)</c:formatCode>
                 <c:ptCount val="2"/>

</xml_diff>